<commit_message>
Update MS1 documentation and Synth assets
</commit_message>
<xml_diff>
--- a/Docs/MS1/M1_summary.docx
+++ b/Docs/MS1/M1_summary.docx
@@ -44,23 +44,13 @@
         <w:spacing w:after="240"/>
         <w:jc w:val="center"/>
       </w:pPr>
-      <w:proofErr w:type="spellStart"/>
       <w:r>
         <w:rPr>
           <w:i/>
           <w:iCs/>
           <w:color w:val="555555"/>
         </w:rPr>
-        <w:t>Modeling</w:t>
-      </w:r>
-      <w:proofErr w:type="spellEnd"/>
-      <w:r>
-        <w:rPr>
-          <w:i/>
-          <w:iCs/>
-          <w:color w:val="555555"/>
-        </w:rPr>
-        <w:t>, Simulation and Automation of Electrical Energy Systems</w:t>
+        <w:t>Modeling, Simulation and Automation of Electrical Energy Systems</w:t>
       </w:r>
     </w:p>
     <w:tbl>
@@ -150,24 +140,31 @@
                 <w:sz w:val="20"/>
                 <w:szCs w:val="20"/>
               </w:rPr>
-              <w:t xml:space="preserve">, Marc </w:t>
+              <w:t>, Marc Steffgen</w:t>
             </w:r>
-            <w:proofErr w:type="spellStart"/>
-            <w:r>
-              <w:rPr>
-                <w:sz w:val="20"/>
-                <w:szCs w:val="20"/>
-              </w:rPr>
-              <w:t>Steffgen</w:t>
-            </w:r>
-            <w:proofErr w:type="spellEnd"/>
             <w:r>
               <w:rPr>
                 <w:sz w:val="20"/>
                 <w:szCs w:val="20"/>
                 <w:lang/>
               </w:rPr>
-              <w:t xml:space="preserve"> ()</w:t>
+              <w:t xml:space="preserve"> (</w:t>
+            </w:r>
+            <w:r>
+              <w:rPr>
+                <w:sz w:val="20"/>
+                <w:szCs w:val="20"/>
+                <w:lang/>
+              </w:rPr>
+              <w:t>11149043</w:t>
+            </w:r>
+            <w:r>
+              <w:rPr>
+                <w:sz w:val="20"/>
+                <w:szCs w:val="20"/>
+                <w:lang/>
+              </w:rPr>
+              <w:t>)</w:t>
             </w:r>
           </w:p>
         </w:tc>
@@ -218,7 +215,22 @@
                 <w:sz w:val="20"/>
                 <w:szCs w:val="20"/>
               </w:rPr>
-              <w:t>1 — Signal acquisition, preprocessing, storage, visualization</w:t>
+              <w:t xml:space="preserve">1 </w:t>
+            </w:r>
+            <w:r>
+              <w:rPr>
+                <w:sz w:val="20"/>
+                <w:szCs w:val="20"/>
+                <w:lang/>
+              </w:rPr>
+              <w:t>-</w:t>
+            </w:r>
+            <w:r>
+              <w:rPr>
+                <w:sz w:val="20"/>
+                <w:szCs w:val="20"/>
+              </w:rPr>
+              <w:t xml:space="preserve"> Signal acquisition, preprocessing, storage, visualization</w:t>
             </w:r>
           </w:p>
         </w:tc>
@@ -267,33 +279,23 @@
             <w:pPr>
               <w:rPr>
                 <w:color w:val="EE0000"/>
+                <w:lang/>
               </w:rPr>
             </w:pPr>
-            <w:r>
-              <w:rPr>
-                <w:color w:val="EE0000"/>
-                <w:sz w:val="20"/>
-                <w:szCs w:val="20"/>
-              </w:rPr>
-              <w:t>[GitHub URL]</w:t>
-            </w:r>
+            <w:hyperlink r:id="rId6" w:history="1">
+              <w:r>
+                <w:rPr>
+                  <w:rStyle w:val="Hyperlink"/>
+                </w:rPr>
+                <w:t>https://github.com/SoheilAyati/MSAEES</w:t>
+              </w:r>
+            </w:hyperlink>
           </w:p>
         </w:tc>
       </w:tr>
     </w:tbl>
     <w:p>
       <w:pPr>
-        <w:pBdr>
-          <w:bottom w:val="single" w:sz="6" w:space="0" w:color="888888"/>
-        </w:pBdr>
-        <w:spacing w:before="240"/>
-        <w:rPr>
-          <w:lang/>
-        </w:rPr>
-      </w:pPr>
-    </w:p>
-    <w:p>
-      <w:pPr>
         <w:pStyle w:val="Heading1"/>
         <w:rPr>
           <w:lang/>
@@ -306,9 +308,19 @@
     <w:p>
       <w:pPr>
         <w:spacing w:after="140"/>
-      </w:pPr>
-      <w:r>
-        <w:t>NILM (Non-Intrusive Load Monitoring) recovers per-appliance power consumption from a single aggregate measurement at the Point of Common Coupling (PCC). Milestone 1 cover</w:t>
+        <w:jc w:val="both"/>
+      </w:pPr>
+      <w:r>
+        <w:t>NILM (Non-Intrusive Load Monitoring)</w:t>
+      </w:r>
+      <w:r>
+        <w:rPr>
+          <w:lang/>
+        </w:rPr>
+        <w:t>[1]</w:t>
+      </w:r>
+      <w:r>
+        <w:t xml:space="preserve"> recovers per-appliance power consumption from a single aggregate measurement at the Point of Common Coupling (PCC). Milestone 1 cover</w:t>
       </w:r>
       <w:r>
         <w:rPr>
@@ -323,6 +335,7 @@
     <w:p>
       <w:pPr>
         <w:spacing w:after="140"/>
+        <w:jc w:val="both"/>
       </w:pPr>
       <w:r>
         <w:t xml:space="preserve">Beyond the milestone requirements, the project deliberately targets </w:t>
@@ -345,6 +358,7 @@
           <w:numId w:val="2"/>
         </w:numPr>
         <w:spacing w:after="80"/>
+        <w:jc w:val="both"/>
       </w:pPr>
       <w:r>
         <w:rPr>
@@ -366,7 +380,19 @@
         <w:rPr>
           <w:lang/>
         </w:rPr>
-        <w:t>. W</w:t>
+        <w:t>.</w:t>
+      </w:r>
+      <w:r>
+        <w:rPr>
+          <w:lang/>
+        </w:rPr>
+        <w:t xml:space="preserve"> This system causes failure in the traditional NILM methods because behind-the-meter generations a so-called signal eclipse [2].</w:t>
+      </w:r>
+      <w:r>
+        <w:rPr>
+          <w:lang/>
+        </w:rPr>
+        <w:t xml:space="preserve"> W</w:t>
       </w:r>
       <w:r>
         <w:t>e address it explicitly through signed power channels and inverter harmonic signatures.</w:t>
@@ -380,6 +406,7 @@
           <w:numId w:val="2"/>
         </w:numPr>
         <w:spacing w:after="80"/>
+        <w:jc w:val="both"/>
       </w:pPr>
       <w:r>
         <w:rPr>
@@ -406,18 +433,23 @@
         </w:rPr>
         <w:t>D</w:t>
       </w:r>
-      <w:proofErr w:type="spellStart"/>
-      <w:r>
-        <w:t>ifferent</w:t>
-      </w:r>
-      <w:proofErr w:type="spellEnd"/>
-      <w:r>
-        <w:t xml:space="preserve"> appliances are most distinguishable in different feature domains.</w:t>
+      <w:r>
+        <w:t>ifferent appliances are most distinguishable in different feature domains</w:t>
+      </w:r>
+      <w:r>
+        <w:rPr>
+          <w:lang/>
+        </w:rPr>
+        <w:t xml:space="preserve"> [3]</w:t>
+      </w:r>
+      <w:r>
+        <w:t>.</w:t>
       </w:r>
     </w:p>
     <w:p>
       <w:pPr>
         <w:spacing w:after="80"/>
+        <w:jc w:val="both"/>
       </w:pPr>
       <w:r>
         <w:t>The Milestone 1 deliverables are: (a) a complete synthetic data pipeline producing PAC4200-format scenario files; (b) preprocessing that handles realistic data quality issues; (c) a PAC4200 Modbus TCP reader ready for Milestone 2 connection; (d) five technical specifications documenting every architectural decision.</w:t>
@@ -434,6 +466,7 @@
     <w:p>
       <w:pPr>
         <w:spacing w:after="140"/>
+        <w:jc w:val="both"/>
         <w:rPr>
           <w:lang/>
         </w:rPr>
@@ -456,9 +489,9 @@
           <w:lang/>
         </w:rPr>
         <w:drawing>
-          <wp:inline distT="0" distB="0" distL="0" distR="0" wp14:anchorId="3388E9D6" wp14:editId="3A08B759">
-            <wp:extent cx="3794760" cy="2184317"/>
-            <wp:effectExtent l="19050" t="19050" r="15240" b="26035"/>
+          <wp:inline distT="0" distB="0" distL="0" distR="0" wp14:anchorId="3388E9D6" wp14:editId="7FAA8691">
+            <wp:extent cx="3912870" cy="2252303"/>
+            <wp:effectExtent l="19050" t="19050" r="11430" b="15240"/>
             <wp:docPr id="813019204" name="Picture 5"/>
             <wp:cNvGraphicFramePr>
               <a:graphicFrameLocks xmlns:a="http://schemas.openxmlformats.org/drawingml/2006/main" noChangeAspect="1"/>
@@ -473,7 +506,7 @@
                     </pic:cNvPicPr>
                   </pic:nvPicPr>
                   <pic:blipFill>
-                    <a:blip r:embed="rId5" cstate="print">
+                    <a:blip r:embed="rId7" cstate="print">
                       <a:extLst>
                         <a:ext uri="{28A0092B-C50C-407E-A947-70E740481C1C}">
                           <a14:useLocalDpi xmlns:a14="http://schemas.microsoft.com/office/drawing/2010/main" val="0"/>
@@ -488,7 +521,7 @@
                   <pic:spPr bwMode="auto">
                     <a:xfrm>
                       <a:off x="0" y="0"/>
-                      <a:ext cx="3840623" cy="2210717"/>
+                      <a:ext cx="3983370" cy="2292884"/>
                     </a:xfrm>
                     <a:prstGeom prst="rect">
                       <a:avLst/>
@@ -510,6 +543,7 @@
     <w:p>
       <w:pPr>
         <w:spacing w:before="80" w:after="240"/>
+        <w:jc w:val="both"/>
       </w:pPr>
       <w:r>
         <w:rPr>
@@ -527,45 +561,26 @@
           <w:sz w:val="18"/>
           <w:szCs w:val="18"/>
         </w:rPr>
-        <w:t xml:space="preserve">Two acquisition paths produce </w:t>
-      </w:r>
-      <w:proofErr w:type="gramStart"/>
-      <w:r>
-        <w:rPr>
-          <w:i/>
-          <w:iCs/>
-          <w:sz w:val="18"/>
-          <w:szCs w:val="18"/>
-        </w:rPr>
-        <w:t>identically-structured</w:t>
-      </w:r>
-      <w:proofErr w:type="gramEnd"/>
-      <w:r>
-        <w:rPr>
-          <w:i/>
-          <w:iCs/>
-          <w:sz w:val="18"/>
-          <w:szCs w:val="18"/>
-        </w:rPr>
-        <w:t xml:space="preserve"> scenario files. The synthetic path (used in Milestone 1) generates per-appliance traces and aggregates them. The real path (Milestone 2) polls a Siemens PAC4200 over Modbus TCP. Downstream of the scenario file, preprocessing, feature engineering, and ML are the same code regardless of source.</w:t>
+        <w:t>Two acquisition paths produce identically-structured scenario files. The synthetic path (used in Milestone 1) generates per-appliance traces and aggregates them. The real path (Milestone 2) polls a Siemens PAC4200 over Modbus TCP. Downstream of the scenario file, preprocessing, feature engineering, and ML are the same code regardless of source.</w:t>
       </w:r>
     </w:p>
     <w:p>
       <w:pPr>
         <w:spacing w:after="140"/>
+        <w:jc w:val="both"/>
         <w:rPr>
           <w:lang/>
         </w:rPr>
       </w:pPr>
       <w:r>
         <w:lastRenderedPageBreak/>
-        <w:t xml:space="preserve">In Milestone 1 we built </w:t>
-      </w:r>
-      <w:r>
-        <w:rPr>
-          <w:color w:val="EE0000"/>
-        </w:rPr>
-        <w:t xml:space="preserve">and validated </w:t>
+        <w:t>In Milestone 1 we built</w:t>
+      </w:r>
+      <w:r>
+        <w:rPr>
+          <w:lang/>
+        </w:rPr>
+        <w:t xml:space="preserve"> </w:t>
       </w:r>
       <w:r>
         <w:t>the complete synthetic path (generators → aggregator → preprocessor). For Milestone 2, the aggregator is replaced by the PAC4200 reader</w:t>
@@ -612,14 +627,6 @@
         </w:rPr>
         <w:t>, although it must be validated and its parameters must be fine-tuned.</w:t>
       </w:r>
-    </w:p>
-    <w:p>
-      <w:pPr>
-        <w:spacing w:after="140"/>
-        <w:rPr>
-          <w:lang/>
-        </w:rPr>
-      </w:pPr>
     </w:p>
     <w:p>
       <w:pPr>
@@ -646,6 +653,7 @@
           <w:numId w:val="2"/>
         </w:numPr>
         <w:spacing w:after="80"/>
+        <w:jc w:val="both"/>
       </w:pPr>
       <w:r>
         <w:rPr>
@@ -666,6 +674,7 @@
           <w:numId w:val="2"/>
         </w:numPr>
         <w:spacing w:after="80"/>
+        <w:jc w:val="both"/>
       </w:pPr>
       <w:r>
         <w:rPr>
@@ -686,6 +695,7 @@
           <w:numId w:val="2"/>
         </w:numPr>
         <w:spacing w:after="80"/>
+        <w:jc w:val="both"/>
       </w:pPr>
       <w:r>
         <w:rPr>
@@ -695,15 +705,7 @@
         <w:t xml:space="preserve">Preprocessor. </w:t>
       </w:r>
       <w:r>
-        <w:t xml:space="preserve">Universal data-hygiene and feature-engineering stage. Validates input, handles </w:t>
-      </w:r>
-      <w:proofErr w:type="spellStart"/>
-      <w:r>
-        <w:t>NaN</w:t>
-      </w:r>
-      <w:proofErr w:type="spellEnd"/>
-      <w:r>
-        <w:t xml:space="preserve"> and Inf, imputes short gaps, clips outliers to physical bounds, builds 12 derived features for downstream ML.</w:t>
+        <w:t>Universal data-hygiene and feature-engineering stage. Validates input, handles NaN and Inf, imputes short gaps, clips outliers to physical bounds, builds 12 derived features for downstream ML.</w:t>
       </w:r>
     </w:p>
     <w:p>
@@ -714,6 +716,7 @@
           <w:numId w:val="2"/>
         </w:numPr>
         <w:spacing w:after="80"/>
+        <w:jc w:val="both"/>
       </w:pPr>
       <w:r>
         <w:rPr>
@@ -734,6 +737,7 @@
           <w:numId w:val="2"/>
         </w:numPr>
         <w:spacing w:after="80"/>
+        <w:jc w:val="both"/>
       </w:pPr>
       <w:r>
         <w:rPr>
@@ -763,6 +767,7 @@
     <w:p>
       <w:pPr>
         <w:spacing w:after="140"/>
+        <w:jc w:val="both"/>
       </w:pPr>
       <w:r>
         <w:t>Four decisions worth defending explicitly. Each is grounded in either a documented PAC4200 capability, an explicit NILM literature requirement, or a synthetic-data advantage.</w:t>
@@ -771,6 +776,7 @@
     <w:p>
       <w:pPr>
         <w:spacing w:after="140"/>
+        <w:jc w:val="both"/>
       </w:pPr>
       <w:r>
         <w:rPr>
@@ -789,108 +795,151 @@
         <w:t>8.5 kHz (170 samples per cycle at 50 Hz)</w:t>
       </w:r>
       <w:r>
-        <w:t xml:space="preserve">, but it does not stream raw waveform over Modbus TCP. It exposes processed values (RMS, P, Q, harmonics), and a full register block poll cycle takes ~200 </w:t>
-      </w:r>
-      <w:proofErr w:type="spellStart"/>
-      <w:r>
-        <w:t>ms</w:t>
-      </w:r>
-      <w:proofErr w:type="spellEnd"/>
-      <w:r>
-        <w:t xml:space="preserve"> in practice. 5 Hz matches what the meter can actually </w:t>
-      </w:r>
-      <w:proofErr w:type="gramStart"/>
-      <w:r>
-        <w:t>deliver, and</w:t>
-      </w:r>
-      <w:proofErr w:type="gramEnd"/>
-      <w:r>
-        <w:t xml:space="preserve"> is comfortably above the time scale of appliance behavior (seconds to minutes).</w:t>
+        <w:rPr>
+          <w:lang/>
+        </w:rPr>
+        <w:t xml:space="preserve"> [4]</w:t>
+      </w:r>
+      <w:r>
+        <w:t>, but it does not stream raw waveform over Modbus TCP. It exposes processed values (RMS, P, Q, harmonics), and a full register block poll cycle takes ~200 ms in practice. 5 Hz matches what the meter can actually deliver, and is comfortably above the time scale of appliance behavior (seconds to minutes).</w:t>
       </w:r>
     </w:p>
     <w:p>
       <w:pPr>
         <w:spacing w:after="140"/>
+        <w:jc w:val="both"/>
       </w:pPr>
       <w:r>
         <w:rPr>
           <w:b/>
           <w:bCs/>
         </w:rPr>
-        <w:t xml:space="preserve">Why harmonics 2nd through 40th, not all 64? </w:t>
-      </w:r>
-      <w:r>
-        <w:t>PAC4200 exposes harmonics up to the 64th, but appliance harmonic content decays rapidly above the 25th. Truncating at 40 keeps headroom while saving ~38% storage on harmonic columns. All harmonics are stored at 5 Hz (the same rate as P and Q) so switching transients and multi-state transitions are temporally resolved at the same resolution as the power signal.</w:t>
-      </w:r>
-    </w:p>
-    <w:p>
-      <w:pPr>
-        <w:spacing w:after="140"/>
-      </w:pPr>
+        <w:t xml:space="preserve">Why harmonics 2nd through </w:t>
+      </w:r>
       <w:r>
         <w:rPr>
           <w:b/>
           <w:bCs/>
-        </w:rPr>
-        <w:t xml:space="preserve">Why synthesize data with embedded ground truth? </w:t>
-      </w:r>
-      <w:r>
-        <w:t xml:space="preserve">Real datasets like UK-DALE and REDD provide aggregate measurements but per-appliance ground truth only through expensive intrusive sub-metering. Because we generate the data, we know exactly which appliance contributed how much power at every timestep. This makes supervised ML in Milestone 2 trivially </w:t>
-      </w:r>
-      <w:proofErr w:type="gramStart"/>
-      <w:r>
-        <w:t>clean, and</w:t>
-      </w:r>
-      <w:proofErr w:type="gramEnd"/>
-      <w:r>
-        <w:t xml:space="preserve"> enables construction of adversarial benchmark scenarios that no real dataset offers.</w:t>
-      </w:r>
-    </w:p>
-    <w:p>
-      <w:pPr>
-        <w:spacing w:after="140"/>
-        <w:rPr>
-          <w:lang/>
-        </w:rPr>
-      </w:pPr>
+          <w:lang/>
+        </w:rPr>
+        <w:t>15</w:t>
+      </w:r>
       <w:r>
         <w:rPr>
           <w:b/>
           <w:bCs/>
         </w:rPr>
+        <w:t xml:space="preserve">th, not all 64? </w:t>
+      </w:r>
+      <w:r>
+        <w:t>PAC4200 exposes harmonics up to the 64th</w:t>
+      </w:r>
+      <w:r>
+        <w:rPr>
+          <w:lang/>
+        </w:rPr>
+        <w:t xml:space="preserve"> [4]</w:t>
+      </w:r>
+      <w:r>
+        <w:t xml:space="preserve">, </w:t>
+      </w:r>
+      <w:r>
+        <w:t>but appliance signatures in the NILM literature are typically characterized by the lowest odd orders (3rd, 5th, 7th)</w:t>
+      </w:r>
+      <w:r>
+        <w:t>.</w:t>
+      </w:r>
+      <w:r>
+        <w:rPr>
+          <w:lang/>
+        </w:rPr>
+        <w:t xml:space="preserve"> For example, </w:t>
+      </w:r>
+      <w:r>
+        <w:t>Tsironi et al. (IEEE 2022)</w:t>
+      </w:r>
+      <w:r>
+        <w:rPr>
+          <w:lang/>
+        </w:rPr>
+        <w:t xml:space="preserve"> [5]</w:t>
+      </w:r>
+      <w:r>
+        <w:t xml:space="preserve"> used only the 3rd, 5th, and 7th harmonic currents for NILM appliance identification.</w:t>
+      </w:r>
+      <w:r>
+        <w:t xml:space="preserve"> Truncating at </w:t>
+      </w:r>
+      <w:r>
+        <w:rPr>
+          <w:lang/>
+        </w:rPr>
+        <w:t>15</w:t>
+      </w:r>
+      <w:r>
+        <w:t xml:space="preserve"> keeps headroom while saving storage on harmonic columns. All harmonics are stored at 5 Hz (the same rate as P and Q) so switching transients and multi-state transitions are temporally resolved at the same resolution as the power signal.</w:t>
+      </w:r>
+    </w:p>
+    <w:p>
+      <w:pPr>
+        <w:spacing w:after="140"/>
+        <w:jc w:val="both"/>
+      </w:pPr>
+      <w:r>
+        <w:rPr>
+          <w:b/>
+          <w:bCs/>
+        </w:rPr>
+        <w:t xml:space="preserve">Why synthesize data with embedded ground truth? </w:t>
+      </w:r>
+      <w:r>
+        <w:t>Real datasets like UK-DALE and REDD provide aggregate measurements but per-appliance ground truth only through expensive intrusive sub-metering. Because we generate the data, we know exactly which appliance contributed how much power at every timestep. This makes supervised ML in Milestone 2 trivially clean, and enables construction of adversarial benchmark scenarios that no real dataset offers.</w:t>
+      </w:r>
+    </w:p>
+    <w:p>
+      <w:pPr>
+        <w:spacing w:after="140"/>
+        <w:jc w:val="both"/>
+        <w:rPr>
+          <w:lang/>
+        </w:rPr>
+      </w:pPr>
+      <w:r>
+        <w:rPr>
+          <w:b/>
+          <w:bCs/>
+        </w:rPr>
         <w:t xml:space="preserve">Why universal preprocessing? </w:t>
       </w:r>
       <w:r>
-        <w:t xml:space="preserve">The preprocessor makes no assumption about its input source. For synthetic data it mostly </w:t>
-      </w:r>
-      <w:proofErr w:type="gramStart"/>
-      <w:r>
-        <w:t>engineers</w:t>
-      </w:r>
-      <w:proofErr w:type="gramEnd"/>
-      <w:r>
-        <w:t xml:space="preserve"> features (the data is already clean); for real PAC4200 data it also handles gaps, outliers, and acquisition noise. Same script, same output schema, no branching by source. This is the architectural choice that makes Milestone 1 </w:t>
-      </w:r>
-      <w:proofErr w:type="gramStart"/>
-      <w:r>
-        <w:t>actually prepare</w:t>
-      </w:r>
-      <w:proofErr w:type="gramEnd"/>
-      <w:r>
-        <w:t xml:space="preserve"> us for Milestone 2.</w:t>
+        <w:t>The preprocessor makes no assumption about its input source. For synthetic data it mostly engineers features (the data is already clean); for real PAC4200 data it also handles gaps, outliers, and acquisition noise. Same script, same output schema, no branching by source. This is the architectural choice that makes Milestone 1 actually prepare us for Milestone 2.</w:t>
+      </w:r>
+    </w:p>
+    <w:p>
+      <w:pPr>
+        <w:pStyle w:val="Heading1"/>
+      </w:pPr>
+      <w:r>
+        <w:lastRenderedPageBreak/>
+        <w:t>4. Results</w:t>
       </w:r>
     </w:p>
     <w:p>
       <w:pPr>
         <w:spacing w:after="140"/>
-        <w:rPr>
-          <w:lang/>
-        </w:rPr>
-      </w:pPr>
+        <w:jc w:val="both"/>
+        <w:rPr>
+          <w:lang/>
+        </w:rPr>
+      </w:pPr>
+      <w:r>
+        <w:t>Synthetic data was generated for all eight appliances plus baseload, aggregated into scenario files, and preprocessed using the production pipeline. Selected outputs are shown below.</w:t>
+      </w:r>
     </w:p>
     <w:p>
       <w:pPr>
         <w:spacing w:after="140"/>
+        <w:jc w:val="both"/>
         <w:rPr>
           <w:lang/>
         </w:rPr>
@@ -899,49 +948,349 @@
     <w:p>
       <w:pPr>
         <w:spacing w:after="140"/>
-        <w:rPr>
-          <w:lang/>
-        </w:rPr>
-      </w:pPr>
+        <w:jc w:val="center"/>
+        <w:rPr>
+          <w:lang/>
+        </w:rPr>
+      </w:pPr>
+      <w:r>
+        <w:rPr>
+          <w:noProof/>
+          <w:lang/>
+        </w:rPr>
+        <w:drawing>
+          <wp:inline distT="0" distB="0" distL="0" distR="0" wp14:anchorId="6FC18AE6" wp14:editId="31FAA2E3">
+            <wp:extent cx="3010477" cy="1839588"/>
+            <wp:effectExtent l="19050" t="19050" r="19050" b="27940"/>
+            <wp:docPr id="1636698376" name="Picture 10"/>
+            <wp:cNvGraphicFramePr>
+              <a:graphicFrameLocks xmlns:a="http://schemas.openxmlformats.org/drawingml/2006/main" noChangeAspect="1"/>
+            </wp:cNvGraphicFramePr>
+            <a:graphic xmlns:a="http://schemas.openxmlformats.org/drawingml/2006/main">
+              <a:graphicData uri="http://schemas.openxmlformats.org/drawingml/2006/picture">
+                <pic:pic xmlns:pic="http://schemas.openxmlformats.org/drawingml/2006/picture">
+                  <pic:nvPicPr>
+                    <pic:cNvPr id="0" name="Picture 49"/>
+                    <pic:cNvPicPr>
+                      <a:picLocks noChangeAspect="1" noChangeArrowheads="1"/>
+                    </pic:cNvPicPr>
+                  </pic:nvPicPr>
+                  <pic:blipFill>
+                    <a:blip r:embed="rId8" cstate="print">
+                      <a:extLst>
+                        <a:ext uri="{28A0092B-C50C-407E-A947-70E740481C1C}">
+                          <a14:useLocalDpi xmlns:a14="http://schemas.microsoft.com/office/drawing/2010/main" val="0"/>
+                        </a:ext>
+                      </a:extLst>
+                    </a:blip>
+                    <a:srcRect/>
+                    <a:stretch>
+                      <a:fillRect/>
+                    </a:stretch>
+                  </pic:blipFill>
+                  <pic:spPr bwMode="auto">
+                    <a:xfrm>
+                      <a:off x="0" y="0"/>
+                      <a:ext cx="3023948" cy="1847820"/>
+                    </a:xfrm>
+                    <a:prstGeom prst="rect">
+                      <a:avLst/>
+                    </a:prstGeom>
+                    <a:noFill/>
+                    <a:ln>
+                      <a:solidFill>
+                        <a:schemeClr val="tx1"/>
+                      </a:solidFill>
+                    </a:ln>
+                  </pic:spPr>
+                </pic:pic>
+              </a:graphicData>
+            </a:graphic>
+          </wp:inline>
+        </w:drawing>
+      </w:r>
     </w:p>
     <w:p>
       <w:pPr>
         <w:spacing w:after="140"/>
-        <w:rPr>
-          <w:lang/>
-        </w:rPr>
-      </w:pPr>
+        <w:jc w:val="center"/>
+        <w:rPr>
+          <w:lang/>
+        </w:rPr>
+      </w:pPr>
+      <w:r>
+        <w:rPr>
+          <w:noProof/>
+          <w:lang/>
+        </w:rPr>
+        <w:drawing>
+          <wp:inline distT="0" distB="0" distL="0" distR="0" wp14:anchorId="494A9342" wp14:editId="5F393D89">
+            <wp:extent cx="3012786" cy="2008635"/>
+            <wp:effectExtent l="19050" t="19050" r="16510" b="10795"/>
+            <wp:docPr id="466483864" name="Picture 9"/>
+            <wp:cNvGraphicFramePr>
+              <a:graphicFrameLocks xmlns:a="http://schemas.openxmlformats.org/drawingml/2006/main" noChangeAspect="1"/>
+            </wp:cNvGraphicFramePr>
+            <a:graphic xmlns:a="http://schemas.openxmlformats.org/drawingml/2006/main">
+              <a:graphicData uri="http://schemas.openxmlformats.org/drawingml/2006/picture">
+                <pic:pic xmlns:pic="http://schemas.openxmlformats.org/drawingml/2006/picture">
+                  <pic:nvPicPr>
+                    <pic:cNvPr id="0" name="Picture 48"/>
+                    <pic:cNvPicPr>
+                      <a:picLocks noChangeAspect="1" noChangeArrowheads="1"/>
+                    </pic:cNvPicPr>
+                  </pic:nvPicPr>
+                  <pic:blipFill>
+                    <a:blip r:embed="rId9" cstate="print">
+                      <a:extLst>
+                        <a:ext uri="{28A0092B-C50C-407E-A947-70E740481C1C}">
+                          <a14:useLocalDpi xmlns:a14="http://schemas.microsoft.com/office/drawing/2010/main" val="0"/>
+                        </a:ext>
+                      </a:extLst>
+                    </a:blip>
+                    <a:srcRect/>
+                    <a:stretch>
+                      <a:fillRect/>
+                    </a:stretch>
+                  </pic:blipFill>
+                  <pic:spPr bwMode="auto">
+                    <a:xfrm>
+                      <a:off x="0" y="0"/>
+                      <a:ext cx="3033521" cy="2022459"/>
+                    </a:xfrm>
+                    <a:prstGeom prst="rect">
+                      <a:avLst/>
+                    </a:prstGeom>
+                    <a:noFill/>
+                    <a:ln>
+                      <a:solidFill>
+                        <a:schemeClr val="tx1"/>
+                      </a:solidFill>
+                    </a:ln>
+                  </pic:spPr>
+                </pic:pic>
+              </a:graphicData>
+            </a:graphic>
+          </wp:inline>
+        </w:drawing>
+      </w:r>
     </w:p>
     <w:p>
       <w:pPr>
         <w:spacing w:after="140"/>
-        <w:rPr>
-          <w:lang/>
-        </w:rPr>
-      </w:pPr>
-    </w:p>
-    <w:p>
-      <w:pPr>
-        <w:pStyle w:val="Heading1"/>
-      </w:pPr>
-      <w:r>
-        <w:t>4. Results</w:t>
+        <w:jc w:val="center"/>
+        <w:rPr>
+          <w:lang/>
+        </w:rPr>
+      </w:pPr>
+      <w:r>
+        <w:rPr>
+          <w:noProof/>
+        </w:rPr>
+        <w:drawing>
+          <wp:inline distT="0" distB="0" distL="0" distR="0" wp14:anchorId="73984F4A" wp14:editId="5FEE978F">
+            <wp:extent cx="3009900" cy="2006490"/>
+            <wp:effectExtent l="19050" t="19050" r="19050" b="13335"/>
+            <wp:docPr id="1730736648" name="Picture 7"/>
+            <wp:cNvGraphicFramePr>
+              <a:graphicFrameLocks xmlns:a="http://schemas.openxmlformats.org/drawingml/2006/main" noChangeAspect="1"/>
+            </wp:cNvGraphicFramePr>
+            <a:graphic xmlns:a="http://schemas.openxmlformats.org/drawingml/2006/main">
+              <a:graphicData uri="http://schemas.openxmlformats.org/drawingml/2006/picture">
+                <pic:pic xmlns:pic="http://schemas.openxmlformats.org/drawingml/2006/picture">
+                  <pic:nvPicPr>
+                    <pic:cNvPr id="0" name="Picture 43"/>
+                    <pic:cNvPicPr>
+                      <a:picLocks noChangeAspect="1" noChangeArrowheads="1"/>
+                    </pic:cNvPicPr>
+                  </pic:nvPicPr>
+                  <pic:blipFill>
+                    <a:blip r:embed="rId10" cstate="print">
+                      <a:extLst>
+                        <a:ext uri="{28A0092B-C50C-407E-A947-70E740481C1C}">
+                          <a14:useLocalDpi xmlns:a14="http://schemas.microsoft.com/office/drawing/2010/main" val="0"/>
+                        </a:ext>
+                      </a:extLst>
+                    </a:blip>
+                    <a:srcRect/>
+                    <a:stretch>
+                      <a:fillRect/>
+                    </a:stretch>
+                  </pic:blipFill>
+                  <pic:spPr bwMode="auto">
+                    <a:xfrm>
+                      <a:off x="0" y="0"/>
+                      <a:ext cx="3050510" cy="2033562"/>
+                    </a:xfrm>
+                    <a:prstGeom prst="rect">
+                      <a:avLst/>
+                    </a:prstGeom>
+                    <a:noFill/>
+                    <a:ln>
+                      <a:solidFill>
+                        <a:schemeClr val="tx1"/>
+                      </a:solidFill>
+                    </a:ln>
+                  </pic:spPr>
+                </pic:pic>
+              </a:graphicData>
+            </a:graphic>
+          </wp:inline>
+        </w:drawing>
       </w:r>
     </w:p>
     <w:p>
       <w:pPr>
         <w:spacing w:after="140"/>
-      </w:pPr>
-      <w:r>
-        <w:t xml:space="preserve">Synthetic data was generated for all eight appliances plus baseload, aggregated into scenario files, and </w:t>
-      </w:r>
-      <w:proofErr w:type="spellStart"/>
-      <w:r>
-        <w:t>preprocessed</w:t>
-      </w:r>
-      <w:proofErr w:type="spellEnd"/>
-      <w:r>
-        <w:t xml:space="preserve"> using the production pipeline. Selected outputs are shown below.</w:t>
+        <w:jc w:val="center"/>
+        <w:rPr>
+          <w:lang/>
+        </w:rPr>
+      </w:pPr>
+    </w:p>
+    <w:p>
+      <w:pPr>
+        <w:spacing w:before="80" w:after="240"/>
+        <w:jc w:val="both"/>
+      </w:pPr>
+      <w:r>
+        <w:rPr>
+          <w:b/>
+          <w:bCs/>
+          <w:sz w:val="18"/>
+          <w:szCs w:val="18"/>
+        </w:rPr>
+        <w:t>Figure 2.</w:t>
+      </w:r>
+      <w:r>
+        <w:rPr>
+          <w:sz w:val="18"/>
+          <w:szCs w:val="18"/>
+        </w:rPr>
+        <w:t xml:space="preserve"> </w:t>
+      </w:r>
+      <w:r>
+        <w:rPr>
+          <w:i/>
+          <w:iCs/>
+          <w:sz w:val="18"/>
+          <w:szCs w:val="18"/>
+        </w:rPr>
+        <w:t>Synthetic per-appliance signatures over a 24-hour day, generated by appliance_generator.py. Each subplot shows three panels: active power P (top), reactive power Q (middle), and the magnitude of the 3rd harmonic current |I_3rd| (bottom). The 3rd harmonic is shown as a representative signature feature</w:t>
+      </w:r>
+      <w:r>
+        <w:rPr>
+          <w:i/>
+          <w:iCs/>
+          <w:sz w:val="18"/>
+          <w:szCs w:val="18"/>
+          <w:lang/>
+        </w:rPr>
+        <w:t xml:space="preserve">, </w:t>
+      </w:r>
+      <w:r>
+        <w:rPr>
+          <w:i/>
+          <w:iCs/>
+          <w:sz w:val="18"/>
+          <w:szCs w:val="18"/>
+        </w:rPr>
+        <w:t xml:space="preserve">nonlinear loads such as inverters and switch-mode supplies produce significant 3rd-harmonic content. </w:t>
+      </w:r>
+      <w:r>
+        <w:rPr>
+          <w:i/>
+          <w:iCs/>
+          <w:sz w:val="18"/>
+          <w:szCs w:val="18"/>
+          <w:lang/>
+        </w:rPr>
+        <w:t>Top</w:t>
+      </w:r>
+      <w:r>
+        <w:rPr>
+          <w:i/>
+          <w:iCs/>
+          <w:sz w:val="18"/>
+          <w:szCs w:val="18"/>
+        </w:rPr>
+        <w:t>: fridge</w:t>
+      </w:r>
+      <w:r>
+        <w:rPr>
+          <w:i/>
+          <w:iCs/>
+          <w:sz w:val="18"/>
+          <w:szCs w:val="18"/>
+          <w:lang/>
+        </w:rPr>
+        <w:t>,</w:t>
+      </w:r>
+      <w:r>
+        <w:rPr>
+          <w:i/>
+          <w:iCs/>
+          <w:sz w:val="18"/>
+          <w:szCs w:val="18"/>
+        </w:rPr>
+        <w:t xml:space="preserve"> a simple cyclic load with regular compressor on/off behavior, modest reactive component, and near-linear current. Middle: washing machine</w:t>
+      </w:r>
+      <w:r>
+        <w:rPr>
+          <w:i/>
+          <w:iCs/>
+          <w:sz w:val="18"/>
+          <w:szCs w:val="18"/>
+          <w:lang/>
+        </w:rPr>
+        <w:t>,</w:t>
+      </w:r>
+      <w:r>
+        <w:rPr>
+          <w:i/>
+          <w:iCs/>
+          <w:sz w:val="18"/>
+          <w:szCs w:val="18"/>
+        </w:rPr>
+        <w:t xml:space="preserve"> a medium-complexity multi-state appliance whose distinct fill, heat, wash, and spin phases produce a stepped P signature with phase-dependent Q. </w:t>
+      </w:r>
+      <w:r>
+        <w:rPr>
+          <w:i/>
+          <w:iCs/>
+          <w:sz w:val="18"/>
+          <w:szCs w:val="18"/>
+          <w:lang/>
+        </w:rPr>
+        <w:t>Bottom</w:t>
+      </w:r>
+      <w:r>
+        <w:rPr>
+          <w:i/>
+          <w:iCs/>
+          <w:sz w:val="18"/>
+          <w:szCs w:val="18"/>
+        </w:rPr>
+        <w:t>: PV generation</w:t>
+      </w:r>
+      <w:r>
+        <w:rPr>
+          <w:i/>
+          <w:iCs/>
+          <w:sz w:val="18"/>
+          <w:szCs w:val="18"/>
+          <w:lang/>
+        </w:rPr>
+        <w:t>,</w:t>
+      </w:r>
+      <w:r>
+        <w:rPr>
+          <w:i/>
+          <w:iCs/>
+          <w:sz w:val="18"/>
+          <w:szCs w:val="18"/>
+        </w:rPr>
+        <w:t xml:space="preserve"> a hard case for NILM, with continuously time-varying negative P following a solar bell curve, near-zero Q (unity-power-factor inverter operation), and 3rd-harmonic content present only when the inverter is active.</w:t>
       </w:r>
     </w:p>
     <w:tbl>
@@ -1001,133 +1350,9 @@
                 <w:sz w:val="24"/>
                 <w:szCs w:val="24"/>
               </w:rPr>
-              <w:t xml:space="preserve">[ FIGURE 2 — </w:t>
+              <w:lastRenderedPageBreak/>
+              <w:t>[ FIGURE 3 — placeholder ]</w:t>
             </w:r>
-            <w:proofErr w:type="gramStart"/>
-            <w:r>
-              <w:rPr>
-                <w:b/>
-                <w:bCs/>
-                <w:color w:val="555555"/>
-                <w:sz w:val="24"/>
-                <w:szCs w:val="24"/>
-              </w:rPr>
-              <w:t>placeholder ]</w:t>
-            </w:r>
-            <w:proofErr w:type="gramEnd"/>
-          </w:p>
-          <w:p>
-            <w:pPr>
-              <w:jc w:val="center"/>
-            </w:pPr>
-            <w:r>
-              <w:rPr>
-                <w:i/>
-                <w:iCs/>
-                <w:color w:val="555555"/>
-                <w:sz w:val="20"/>
-                <w:szCs w:val="20"/>
-              </w:rPr>
-              <w:t>Per-appliance signatures over a 24-hour day</w:t>
-            </w:r>
-          </w:p>
-        </w:tc>
-      </w:tr>
-    </w:tbl>
-    <w:p>
-      <w:pPr>
-        <w:spacing w:before="80" w:after="240"/>
-      </w:pPr>
-      <w:r>
-        <w:rPr>
-          <w:b/>
-          <w:bCs/>
-          <w:sz w:val="18"/>
-          <w:szCs w:val="18"/>
-        </w:rPr>
-        <w:t xml:space="preserve">Figure 2. </w:t>
-      </w:r>
-      <w:r>
-        <w:rPr>
-          <w:i/>
-          <w:iCs/>
-          <w:sz w:val="18"/>
-          <w:szCs w:val="18"/>
-        </w:rPr>
-        <w:t>Synthetic traces of P (active power) for each of the eight project appliances plus baseload. Fridge cycles through compressor on/off with visible inrush transients; hair dryer shows brief evening bursts at ~2 kW; washing machine displays its multi-phase fill-heat-wash-spin sequence; PV produces negative power following a solar bell curve (summer solstice anchor); the synchronous machine spans all four quadrants of the (P, Q) plane.</w:t>
-      </w:r>
-    </w:p>
-    <w:tbl>
-      <w:tblPr>
-        <w:tblW w:w="9026" w:type="dxa"/>
-        <w:tblBorders>
-          <w:top w:val="single" w:sz="4" w:space="0" w:color="auto"/>
-          <w:left w:val="single" w:sz="4" w:space="0" w:color="auto"/>
-          <w:bottom w:val="single" w:sz="4" w:space="0" w:color="auto"/>
-          <w:right w:val="single" w:sz="4" w:space="0" w:color="auto"/>
-          <w:insideH w:val="single" w:sz="4" w:space="0" w:color="auto"/>
-          <w:insideV w:val="single" w:sz="4" w:space="0" w:color="auto"/>
-        </w:tblBorders>
-        <w:tblCellMar>
-          <w:left w:w="10" w:type="dxa"/>
-          <w:right w:w="10" w:type="dxa"/>
-        </w:tblCellMar>
-        <w:tblLook w:val="04A0" w:firstRow="1" w:lastRow="0" w:firstColumn="1" w:lastColumn="0" w:noHBand="0" w:noVBand="1"/>
-      </w:tblPr>
-      <w:tblGrid>
-        <w:gridCol w:w="9026"/>
-      </w:tblGrid>
-      <w:tr>
-        <w:tblPrEx>
-          <w:tblCellMar>
-            <w:top w:w="0" w:type="dxa"/>
-            <w:bottom w:w="0" w:type="dxa"/>
-          </w:tblCellMar>
-        </w:tblPrEx>
-        <w:tc>
-          <w:tcPr>
-            <w:tcW w:w="9026" w:type="dxa"/>
-            <w:tcBorders>
-              <w:top w:val="dashed" w:sz="6" w:space="0" w:color="888888"/>
-              <w:left w:val="dashed" w:sz="6" w:space="0" w:color="888888"/>
-              <w:bottom w:val="dashed" w:sz="6" w:space="0" w:color="888888"/>
-              <w:right w:val="dashed" w:sz="6" w:space="0" w:color="888888"/>
-            </w:tcBorders>
-            <w:shd w:val="clear" w:color="auto" w:fill="F2F2F2"/>
-            <w:tcMar>
-              <w:top w:w="480" w:type="dxa"/>
-              <w:left w:w="240" w:type="dxa"/>
-              <w:bottom w:w="480" w:type="dxa"/>
-              <w:right w:w="240" w:type="dxa"/>
-            </w:tcMar>
-          </w:tcPr>
-          <w:p>
-            <w:pPr>
-              <w:spacing w:after="100"/>
-              <w:jc w:val="center"/>
-            </w:pPr>
-            <w:r>
-              <w:rPr>
-                <w:b/>
-                <w:bCs/>
-                <w:color w:val="555555"/>
-                <w:sz w:val="24"/>
-                <w:szCs w:val="24"/>
-              </w:rPr>
-              <w:t xml:space="preserve">[ FIGURE 3 — </w:t>
-            </w:r>
-            <w:proofErr w:type="gramStart"/>
-            <w:r>
-              <w:rPr>
-                <w:b/>
-                <w:bCs/>
-                <w:color w:val="555555"/>
-                <w:sz w:val="24"/>
-                <w:szCs w:val="24"/>
-              </w:rPr>
-              <w:t>placeholder ]</w:t>
-            </w:r>
-            <w:proofErr w:type="gramEnd"/>
           </w:p>
           <w:p>
             <w:pPr>
@@ -1150,6 +1375,7 @@
     <w:p>
       <w:pPr>
         <w:spacing w:before="80" w:after="240"/>
+        <w:jc w:val="both"/>
       </w:pPr>
       <w:r>
         <w:rPr>
@@ -1167,19 +1393,98 @@
           <w:sz w:val="18"/>
           <w:szCs w:val="18"/>
         </w:rPr>
-        <w:t xml:space="preserve">Top panel: aggregate </w:t>
-      </w:r>
-      <w:proofErr w:type="spellStart"/>
-      <w:r>
+        <w:t>A normal-tier aggregated scenario (scenario_normal.h5) over 24 hours at 5 Hz, produced by scenario_aggregator.py from the per-appliance traces. The signal at the Point of Common Coupling combines eight appliances plus baseload, with PV generation pulling the aggregate negative during midday, and evening activity (cooking, EV charging) dominating after sunset. This is the only signal a real PAC4200 sees at the PCC; the Milestone 2 ML task is to recover the per-appliance contributions from precisely this kind of trace.</w:t>
+      </w:r>
+    </w:p>
+    <w:p>
+      <w:pPr>
+        <w:spacing w:before="80" w:after="240"/>
+        <w:jc w:val="center"/>
+        <w:rPr>
+          <w:b/>
+          <w:bCs/>
+          <w:sz w:val="18"/>
+          <w:szCs w:val="18"/>
+          <w:lang/>
+        </w:rPr>
+      </w:pPr>
+      <w:r>
+        <w:rPr>
+          <w:noProof/>
+          <w:lang/>
+        </w:rPr>
+        <w:drawing>
+          <wp:inline distT="0" distB="0" distL="0" distR="0" wp14:anchorId="1A8855FE" wp14:editId="44F1D8A4">
+            <wp:extent cx="3800563" cy="2292884"/>
+            <wp:effectExtent l="19050" t="19050" r="9525" b="12700"/>
+            <wp:docPr id="1166170492" name="Picture 5"/>
+            <wp:cNvGraphicFramePr>
+              <a:graphicFrameLocks xmlns:a="http://schemas.openxmlformats.org/drawingml/2006/main" noChangeAspect="1"/>
+            </wp:cNvGraphicFramePr>
+            <a:graphic xmlns:a="http://schemas.openxmlformats.org/drawingml/2006/main">
+              <a:graphicData uri="http://schemas.openxmlformats.org/drawingml/2006/picture">
+                <pic:pic xmlns:pic="http://schemas.openxmlformats.org/drawingml/2006/picture">
+                  <pic:nvPicPr>
+                    <pic:cNvPr id="1166170492" name="Picture 5"/>
+                    <pic:cNvPicPr>
+                      <a:picLocks noChangeAspect="1" noChangeArrowheads="1"/>
+                    </pic:cNvPicPr>
+                  </pic:nvPicPr>
+                  <pic:blipFill>
+                    <a:blip r:embed="rId11" cstate="print">
+                      <a:extLst>
+                        <a:ext uri="{28A0092B-C50C-407E-A947-70E740481C1C}">
+                          <a14:useLocalDpi xmlns:a14="http://schemas.microsoft.com/office/drawing/2010/main" val="0"/>
+                        </a:ext>
+                      </a:extLst>
+                    </a:blip>
+                    <a:stretch>
+                      <a:fillRect/>
+                    </a:stretch>
+                  </pic:blipFill>
+                  <pic:spPr bwMode="auto">
+                    <a:xfrm>
+                      <a:off x="0" y="0"/>
+                      <a:ext cx="3800563" cy="2292884"/>
+                    </a:xfrm>
+                    <a:prstGeom prst="rect">
+                      <a:avLst/>
+                    </a:prstGeom>
+                    <a:noFill/>
+                    <a:ln>
+                      <a:solidFill>
+                        <a:schemeClr val="tx1"/>
+                      </a:solidFill>
+                    </a:ln>
+                  </pic:spPr>
+                </pic:pic>
+              </a:graphicData>
+            </a:graphic>
+          </wp:inline>
+        </w:drawing>
+      </w:r>
+    </w:p>
+    <w:p>
+      <w:pPr>
+        <w:spacing w:before="80" w:after="240"/>
+        <w:jc w:val="both"/>
         <w:rPr>
           <w:i/>
           <w:iCs/>
           <w:sz w:val="18"/>
           <w:szCs w:val="18"/>
-        </w:rPr>
-        <w:t>P_total</w:t>
-      </w:r>
-      <w:proofErr w:type="spellEnd"/>
+          <w:lang/>
+        </w:rPr>
+      </w:pPr>
+      <w:r>
+        <w:rPr>
+          <w:b/>
+          <w:bCs/>
+          <w:sz w:val="18"/>
+          <w:szCs w:val="18"/>
+        </w:rPr>
+        <w:t xml:space="preserve">Figure 4. </w:t>
+      </w:r>
       <w:r>
         <w:rPr>
           <w:i/>
@@ -1187,324 +1492,117 @@
           <w:sz w:val="18"/>
           <w:szCs w:val="18"/>
         </w:rPr>
-        <w:t xml:space="preserve"> at the point of common coupling — the only signal a real PAC4200 sees. Per-phase and neutral currents shown in middle panels. Bottom panel: ground-truth per-appliance breakdown, available only because the data is synthetic. The Milestone 2 ML task is precisely to recover the bottom panel from the top, given only the aggregate.</w:t>
-      </w:r>
-    </w:p>
-    <w:tbl>
-      <w:tblPr>
-        <w:tblW w:w="9026" w:type="dxa"/>
-        <w:tblBorders>
-          <w:top w:val="single" w:sz="4" w:space="0" w:color="auto"/>
-          <w:left w:val="single" w:sz="4" w:space="0" w:color="auto"/>
-          <w:bottom w:val="single" w:sz="4" w:space="0" w:color="auto"/>
-          <w:right w:val="single" w:sz="4" w:space="0" w:color="auto"/>
-          <w:insideH w:val="single" w:sz="4" w:space="0" w:color="auto"/>
-          <w:insideV w:val="single" w:sz="4" w:space="0" w:color="auto"/>
-        </w:tblBorders>
-        <w:tblCellMar>
-          <w:left w:w="10" w:type="dxa"/>
-          <w:right w:w="10" w:type="dxa"/>
-        </w:tblCellMar>
-        <w:tblLook w:val="04A0" w:firstRow="1" w:lastRow="0" w:firstColumn="1" w:lastColumn="0" w:noHBand="0" w:noVBand="1"/>
-      </w:tblPr>
-      <w:tblGrid>
-        <w:gridCol w:w="9026"/>
-      </w:tblGrid>
-      <w:tr>
-        <w:tblPrEx>
-          <w:tblCellMar>
-            <w:top w:w="0" w:type="dxa"/>
-            <w:bottom w:w="0" w:type="dxa"/>
-          </w:tblCellMar>
-        </w:tblPrEx>
-        <w:tc>
-          <w:tcPr>
-            <w:tcW w:w="9026" w:type="dxa"/>
-            <w:tcBorders>
-              <w:top w:val="dashed" w:sz="6" w:space="0" w:color="888888"/>
-              <w:left w:val="dashed" w:sz="6" w:space="0" w:color="888888"/>
-              <w:bottom w:val="dashed" w:sz="6" w:space="0" w:color="888888"/>
-              <w:right w:val="dashed" w:sz="6" w:space="0" w:color="888888"/>
-            </w:tcBorders>
-            <w:shd w:val="clear" w:color="auto" w:fill="F2F2F2"/>
-            <w:tcMar>
-              <w:top w:w="480" w:type="dxa"/>
-              <w:left w:w="240" w:type="dxa"/>
-              <w:bottom w:w="480" w:type="dxa"/>
-              <w:right w:w="240" w:type="dxa"/>
-            </w:tcMar>
-          </w:tcPr>
-          <w:p>
-            <w:pPr>
-              <w:spacing w:after="100"/>
-              <w:jc w:val="center"/>
-            </w:pPr>
-            <w:r>
-              <w:rPr>
-                <w:b/>
-                <w:bCs/>
-                <w:color w:val="555555"/>
-                <w:sz w:val="24"/>
-                <w:szCs w:val="24"/>
-              </w:rPr>
-              <w:t xml:space="preserve">[ FIGURE 4 — </w:t>
-            </w:r>
-            <w:proofErr w:type="gramStart"/>
-            <w:r>
-              <w:rPr>
-                <w:b/>
-                <w:bCs/>
-                <w:color w:val="555555"/>
-                <w:sz w:val="24"/>
-                <w:szCs w:val="24"/>
-              </w:rPr>
-              <w:t>placeholder ]</w:t>
-            </w:r>
-            <w:proofErr w:type="gramEnd"/>
-          </w:p>
-          <w:p>
-            <w:pPr>
-              <w:jc w:val="center"/>
-            </w:pPr>
-            <w:r>
-              <w:rPr>
-                <w:i/>
-                <w:iCs/>
-                <w:color w:val="555555"/>
-                <w:sz w:val="20"/>
-                <w:szCs w:val="20"/>
-              </w:rPr>
-              <w:t>Preprocessing demonstration — handling injected data-quality issues</w:t>
-            </w:r>
-          </w:p>
-        </w:tc>
-      </w:tr>
-    </w:tbl>
+        <w:t>Raw V_L1 recorded from pac_reader.py running in simulation mode with --sim-dropout-rate 0.1 (60-second recording, 10% per-sample dropout rate). The dropouts appear as gaps and discontinuities where Modbus polls failed and the reader wrote NaN with synthesized timestamps. This realistically emulates the kind of network-level acquisition issues that occur on real PAC4200 deployments. The same data-quality issues will be present in Milestone 2 recordings, just at lower rates (typically &lt;2% dropouts on a stable local network).</w:t>
+      </w:r>
+    </w:p>
     <w:p>
       <w:pPr>
         <w:spacing w:before="80" w:after="240"/>
-      </w:pPr>
-      <w:r>
+        <w:jc w:val="center"/>
         <w:rPr>
           <w:b/>
           <w:bCs/>
           <w:sz w:val="18"/>
           <w:szCs w:val="18"/>
-        </w:rPr>
-        <w:t xml:space="preserve">Figure 4. </w:t>
-      </w:r>
-      <w:r>
+          <w:lang/>
+        </w:rPr>
+      </w:pPr>
+      <w:r>
+        <w:rPr>
+          <w:noProof/>
+          <w:lang/>
+        </w:rPr>
+        <w:drawing>
+          <wp:inline distT="0" distB="0" distL="0" distR="0" wp14:anchorId="4CFBB914" wp14:editId="2CC60D1D">
+            <wp:extent cx="3800563" cy="2292883"/>
+            <wp:effectExtent l="19050" t="19050" r="9525" b="12700"/>
+            <wp:docPr id="698979364" name="Picture 5"/>
+            <wp:cNvGraphicFramePr>
+              <a:graphicFrameLocks xmlns:a="http://schemas.openxmlformats.org/drawingml/2006/main" noChangeAspect="1"/>
+            </wp:cNvGraphicFramePr>
+            <a:graphic xmlns:a="http://schemas.openxmlformats.org/drawingml/2006/main">
+              <a:graphicData uri="http://schemas.openxmlformats.org/drawingml/2006/picture">
+                <pic:pic xmlns:pic="http://schemas.openxmlformats.org/drawingml/2006/picture">
+                  <pic:nvPicPr>
+                    <pic:cNvPr id="698979364" name="Picture 5"/>
+                    <pic:cNvPicPr>
+                      <a:picLocks noChangeAspect="1" noChangeArrowheads="1"/>
+                    </pic:cNvPicPr>
+                  </pic:nvPicPr>
+                  <pic:blipFill>
+                    <a:blip r:embed="rId12" cstate="print">
+                      <a:extLst>
+                        <a:ext uri="{28A0092B-C50C-407E-A947-70E740481C1C}">
+                          <a14:useLocalDpi xmlns:a14="http://schemas.microsoft.com/office/drawing/2010/main" val="0"/>
+                        </a:ext>
+                      </a:extLst>
+                    </a:blip>
+                    <a:stretch>
+                      <a:fillRect/>
+                    </a:stretch>
+                  </pic:blipFill>
+                  <pic:spPr bwMode="auto">
+                    <a:xfrm>
+                      <a:off x="0" y="0"/>
+                      <a:ext cx="3800563" cy="2292883"/>
+                    </a:xfrm>
+                    <a:prstGeom prst="rect">
+                      <a:avLst/>
+                    </a:prstGeom>
+                    <a:noFill/>
+                    <a:ln>
+                      <a:solidFill>
+                        <a:schemeClr val="tx1"/>
+                      </a:solidFill>
+                    </a:ln>
+                  </pic:spPr>
+                </pic:pic>
+              </a:graphicData>
+            </a:graphic>
+          </wp:inline>
+        </w:drawing>
+      </w:r>
+    </w:p>
+    <w:p>
+      <w:pPr>
+        <w:spacing w:before="80" w:after="240"/>
+        <w:jc w:val="both"/>
         <w:rPr>
           <w:i/>
           <w:iCs/>
           <w:sz w:val="18"/>
           <w:szCs w:val="18"/>
-        </w:rPr>
-        <w:t>Raw scenario data was corrupted with 50 single-sample dropouts, 5 dropout bursts, an infinity-valued spike, and out-of-bounds outliers, then run through the universal preprocessor. The preprocessor imputed all short gaps via linear interpolation, flagged longer gaps, and clipped outliers to physical bounds. The same code path will run on real PAC4200 data in Milestone 2.</w:t>
-      </w:r>
-    </w:p>
-    <w:tbl>
-      <w:tblPr>
-        <w:tblW w:w="9026" w:type="dxa"/>
-        <w:tblBorders>
-          <w:top w:val="single" w:sz="4" w:space="0" w:color="auto"/>
-          <w:left w:val="single" w:sz="4" w:space="0" w:color="auto"/>
-          <w:bottom w:val="single" w:sz="4" w:space="0" w:color="auto"/>
-          <w:right w:val="single" w:sz="4" w:space="0" w:color="auto"/>
-          <w:insideH w:val="single" w:sz="4" w:space="0" w:color="auto"/>
-          <w:insideV w:val="single" w:sz="4" w:space="0" w:color="auto"/>
-        </w:tblBorders>
-        <w:tblCellMar>
-          <w:left w:w="10" w:type="dxa"/>
-          <w:right w:w="10" w:type="dxa"/>
-        </w:tblCellMar>
-        <w:tblLook w:val="04A0" w:firstRow="1" w:lastRow="0" w:firstColumn="1" w:lastColumn="0" w:noHBand="0" w:noVBand="1"/>
-      </w:tblPr>
-      <w:tblGrid>
-        <w:gridCol w:w="9026"/>
-      </w:tblGrid>
-      <w:tr>
-        <w:tblPrEx>
-          <w:tblCellMar>
-            <w:top w:w="0" w:type="dxa"/>
-            <w:bottom w:w="0" w:type="dxa"/>
-          </w:tblCellMar>
-        </w:tblPrEx>
-        <w:tc>
-          <w:tcPr>
-            <w:tcW w:w="9026" w:type="dxa"/>
-            <w:tcBorders>
-              <w:top w:val="dashed" w:sz="6" w:space="0" w:color="888888"/>
-              <w:left w:val="dashed" w:sz="6" w:space="0" w:color="888888"/>
-              <w:bottom w:val="dashed" w:sz="6" w:space="0" w:color="888888"/>
-              <w:right w:val="dashed" w:sz="6" w:space="0" w:color="888888"/>
-            </w:tcBorders>
-            <w:shd w:val="clear" w:color="auto" w:fill="F2F2F2"/>
-            <w:tcMar>
-              <w:top w:w="480" w:type="dxa"/>
-              <w:left w:w="240" w:type="dxa"/>
-              <w:bottom w:w="480" w:type="dxa"/>
-              <w:right w:w="240" w:type="dxa"/>
-            </w:tcMar>
-          </w:tcPr>
-          <w:p>
-            <w:pPr>
-              <w:spacing w:after="100"/>
-              <w:jc w:val="center"/>
-            </w:pPr>
-            <w:r>
-              <w:rPr>
-                <w:b/>
-                <w:bCs/>
-                <w:color w:val="555555"/>
-                <w:sz w:val="24"/>
-                <w:szCs w:val="24"/>
-              </w:rPr>
-              <w:t xml:space="preserve">[ FIGURE 5 — </w:t>
-            </w:r>
-            <w:proofErr w:type="gramStart"/>
-            <w:r>
-              <w:rPr>
-                <w:b/>
-                <w:bCs/>
-                <w:color w:val="555555"/>
-                <w:sz w:val="24"/>
-                <w:szCs w:val="24"/>
-              </w:rPr>
-              <w:t>placeholder ]</w:t>
-            </w:r>
-            <w:proofErr w:type="gramEnd"/>
-          </w:p>
-          <w:p>
-            <w:pPr>
-              <w:jc w:val="center"/>
-            </w:pPr>
-            <w:r>
-              <w:rPr>
-                <w:i/>
-                <w:iCs/>
-                <w:color w:val="555555"/>
-                <w:sz w:val="20"/>
-                <w:szCs w:val="20"/>
-              </w:rPr>
-              <w:t>Event-detection feature: |</w:t>
-            </w:r>
-            <w:proofErr w:type="spellStart"/>
-            <w:r>
-              <w:rPr>
-                <w:i/>
-                <w:iCs/>
-                <w:color w:val="555555"/>
-                <w:sz w:val="20"/>
-                <w:szCs w:val="20"/>
-              </w:rPr>
-              <w:t>dP_total</w:t>
-            </w:r>
-            <w:proofErr w:type="spellEnd"/>
-            <w:r>
-              <w:rPr>
-                <w:i/>
-                <w:iCs/>
-                <w:color w:val="555555"/>
-                <w:sz w:val="20"/>
-                <w:szCs w:val="20"/>
-              </w:rPr>
-              <w:t>/dt|</w:t>
-            </w:r>
-          </w:p>
-        </w:tc>
-      </w:tr>
-    </w:tbl>
-    <w:p>
-      <w:pPr>
-        <w:spacing w:before="80" w:after="240"/>
+          <w:lang/>
+        </w:rPr>
+      </w:pPr>
+      <w:r>
+        <w:rPr>
+          <w:b/>
+          <w:bCs/>
+          <w:sz w:val="18"/>
+          <w:szCs w:val="18"/>
+        </w:rPr>
+        <w:t xml:space="preserve">Figure 5. </w:t>
+      </w:r>
+      <w:r>
         <w:rPr>
           <w:i/>
           <w:iCs/>
           <w:sz w:val="18"/>
           <w:szCs w:val="18"/>
-          <w:lang/>
-        </w:rPr>
-      </w:pPr>
-      <w:r>
-        <w:rPr>
-          <w:b/>
-          <w:bCs/>
-          <w:sz w:val="18"/>
-          <w:szCs w:val="18"/>
-        </w:rPr>
-        <w:t xml:space="preserve">Figure 5. </w:t>
-      </w:r>
-      <w:r>
+        </w:rPr>
+        <w:t>The same V_L1 recording from Figure 4 after running through preprocessor.py. The preprocessor's gap-imputation step has filled short NaN runs (≤5 samples = 1 second at 5 Hz) by linear interpolation between neighboring valid samples; longer gaps would have been preserved as NaN and flagged in the report. The reconstructed signal is now suitable for downstream feature extraction and ML, with the data-quality summary recorded in the file's /preprocessed/attrs/report metadata for audit. The same preprocessing code path runs unchanged on synthetic aggregator output and real PAC4200 recordings.</w:t>
+      </w:r>
+    </w:p>
+    <w:p>
+      <w:pPr>
+        <w:spacing w:before="80" w:after="240"/>
+        <w:jc w:val="both"/>
         <w:rPr>
           <w:i/>
           <w:iCs/>
           <w:sz w:val="18"/>
           <w:szCs w:val="18"/>
-        </w:rPr>
-        <w:t xml:space="preserve">First-difference of </w:t>
-      </w:r>
-      <w:proofErr w:type="spellStart"/>
-      <w:r>
-        <w:rPr>
-          <w:i/>
-          <w:iCs/>
-          <w:sz w:val="18"/>
-          <w:szCs w:val="18"/>
-        </w:rPr>
-        <w:t>P_total</w:t>
-      </w:r>
-      <w:proofErr w:type="spellEnd"/>
-      <w:r>
-        <w:rPr>
-          <w:i/>
-          <w:iCs/>
-          <w:sz w:val="18"/>
-          <w:szCs w:val="18"/>
-        </w:rPr>
-        <w:t xml:space="preserve"> computed by the preprocessor — the headline event-detection feature for Milestone 2. Each peak corresponds to an appliance switching event; the largest peak corresponds to the EV plugging in at ~21:00. This is a direct input to event-based NILM classifiers in Milestone 2.</w:t>
-      </w:r>
-    </w:p>
-    <w:p>
-      <w:pPr>
-        <w:spacing w:before="80" w:after="240"/>
-        <w:rPr>
-          <w:i/>
-          <w:iCs/>
-          <w:sz w:val="18"/>
-          <w:szCs w:val="18"/>
-          <w:lang/>
-        </w:rPr>
-      </w:pPr>
-    </w:p>
-    <w:p>
-      <w:pPr>
-        <w:spacing w:before="80" w:after="240"/>
-        <w:rPr>
-          <w:i/>
-          <w:iCs/>
-          <w:sz w:val="18"/>
-          <w:szCs w:val="18"/>
-          <w:lang/>
-        </w:rPr>
-      </w:pPr>
-    </w:p>
-    <w:p>
-      <w:pPr>
-        <w:spacing w:before="80" w:after="240"/>
-        <w:rPr>
-          <w:i/>
-          <w:iCs/>
-          <w:sz w:val="18"/>
-          <w:szCs w:val="18"/>
-          <w:lang/>
-        </w:rPr>
-      </w:pPr>
-    </w:p>
-    <w:p>
-      <w:pPr>
-        <w:spacing w:before="80" w:after="240"/>
-        <w:rPr>
           <w:lang/>
         </w:rPr>
       </w:pPr>
@@ -1514,12 +1612,14 @@
         <w:pStyle w:val="Heading1"/>
       </w:pPr>
       <w:r>
+        <w:lastRenderedPageBreak/>
         <w:t>5. Milestone 2 readiness</w:t>
       </w:r>
     </w:p>
     <w:p>
       <w:pPr>
         <w:spacing w:after="140"/>
+        <w:jc w:val="both"/>
       </w:pPr>
       <w:r>
         <w:t>The PAC4200 reader has been validated end-to-end in simulation mode. The reader produces files structurally identical to aggregator outputs, the preprocessor handles both transparently, and gap imputation works on simulated Modbus dropouts using the same code path it applies to synthetic data.</w:t>
@@ -1528,6 +1628,7 @@
     <w:p>
       <w:pPr>
         <w:spacing w:after="140"/>
+        <w:jc w:val="both"/>
       </w:pPr>
       <w:r>
         <w:t>For Milestone 2, the work reduces to:</w:t>
@@ -1541,6 +1642,7 @@
           <w:numId w:val="2"/>
         </w:numPr>
         <w:spacing w:after="80"/>
+        <w:jc w:val="both"/>
       </w:pPr>
       <w:r>
         <w:t>Verifying register addresses against the live PAC4200</w:t>
@@ -1560,6 +1662,7 @@
           <w:numId w:val="2"/>
         </w:numPr>
         <w:spacing w:after="80"/>
+        <w:jc w:val="both"/>
       </w:pPr>
       <w:r>
         <w:t>Confirming float byte order (</w:t>
@@ -1582,6 +1685,7 @@
           <w:numId w:val="2"/>
         </w:numPr>
         <w:spacing w:after="80"/>
+        <w:jc w:val="both"/>
       </w:pPr>
       <w:r>
         <w:t>Beginning lab recordings; the downstream pipeline is already built.</w:t>
@@ -1595,6 +1699,7 @@
           <w:numId w:val="2"/>
         </w:numPr>
         <w:spacing w:after="80"/>
+        <w:jc w:val="both"/>
         <w:rPr>
           <w:b/>
           <w:bCs/>
@@ -1627,6 +1732,7 @@
     <w:p>
       <w:pPr>
         <w:spacing w:after="140"/>
+        <w:jc w:val="both"/>
       </w:pPr>
       <w:r>
         <w:t>Milestone 2 ML development can</w:t>
@@ -1670,6 +1776,7 @@
     <w:p>
       <w:pPr>
         <w:spacing w:after="140"/>
+        <w:jc w:val="both"/>
       </w:pPr>
       <w:r>
         <w:t>Detailed specifications for every component are committed to the project repository in the Docs/ folder:</w:t>
@@ -1683,6 +1790,7 @@
           <w:numId w:val="2"/>
         </w:numPr>
         <w:spacing w:after="80"/>
+        <w:jc w:val="both"/>
       </w:pPr>
       <w:r>
         <w:t>01_data_format.md — on-disk format, channels, sampling rates, sign conventions</w:t>
@@ -1696,6 +1804,7 @@
           <w:numId w:val="2"/>
         </w:numPr>
         <w:spacing w:after="80"/>
+        <w:jc w:val="both"/>
       </w:pPr>
       <w:r>
         <w:t>02_appliance_generator.md — per-appliance state machines, signatures, parameters</w:t>
@@ -1709,6 +1818,7 @@
           <w:numId w:val="2"/>
         </w:numPr>
         <w:spacing w:after="80"/>
+        <w:jc w:val="both"/>
       </w:pPr>
       <w:r>
         <w:t>03_aggregator.md — aggregation math, voltage synthesis, complex harmonic summation</w:t>
@@ -1722,6 +1832,7 @@
           <w:numId w:val="2"/>
         </w:numPr>
         <w:spacing w:after="80"/>
+        <w:jc w:val="both"/>
       </w:pPr>
       <w:r>
         <w:t>04_preprocessor.md — validation, gap handling, outlier policy, 12 derived features</w:t>
@@ -1735,6 +1846,7 @@
           <w:numId w:val="2"/>
         </w:numPr>
         <w:spacing w:after="80"/>
+        <w:jc w:val="both"/>
       </w:pPr>
       <w:r>
         <w:t>05_pac4200_reader.md — Modbus register map, threading, M2 verification checklist</w:t>
@@ -1743,6 +1855,7 @@
     <w:p>
       <w:pPr>
         <w:spacing w:after="140"/>
+        <w:jc w:val="both"/>
         <w:rPr>
           <w:lang/>
         </w:rPr>
@@ -1777,6 +1890,347 @@
       <w:r>
         <w:t xml:space="preserve"> compressed); the synthetic dataset is regeneratable from the included scripts and the manifest, which is the reproducibility convention common in machine learning research.</w:t>
       </w:r>
+    </w:p>
+    <w:p>
+      <w:pPr>
+        <w:spacing w:after="140"/>
+        <w:jc w:val="both"/>
+        <w:rPr>
+          <w:lang/>
+        </w:rPr>
+      </w:pPr>
+    </w:p>
+    <w:p>
+      <w:pPr>
+        <w:spacing w:after="140"/>
+        <w:jc w:val="both"/>
+        <w:rPr>
+          <w:lang/>
+        </w:rPr>
+      </w:pPr>
+    </w:p>
+    <w:p>
+      <w:pPr>
+        <w:spacing w:after="140"/>
+        <w:jc w:val="both"/>
+        <w:rPr>
+          <w:lang/>
+        </w:rPr>
+      </w:pPr>
+    </w:p>
+    <w:p>
+      <w:pPr>
+        <w:spacing w:after="140"/>
+        <w:jc w:val="both"/>
+        <w:rPr>
+          <w:lang/>
+        </w:rPr>
+      </w:pPr>
+    </w:p>
+    <w:p>
+      <w:pPr>
+        <w:spacing w:after="140"/>
+        <w:jc w:val="both"/>
+        <w:rPr>
+          <w:lang/>
+        </w:rPr>
+      </w:pPr>
+    </w:p>
+    <w:p>
+      <w:pPr>
+        <w:spacing w:after="140"/>
+        <w:jc w:val="both"/>
+        <w:rPr>
+          <w:lang/>
+        </w:rPr>
+      </w:pPr>
+    </w:p>
+    <w:p>
+      <w:pPr>
+        <w:spacing w:after="140"/>
+        <w:jc w:val="both"/>
+        <w:rPr>
+          <w:lang/>
+        </w:rPr>
+      </w:pPr>
+    </w:p>
+    <w:p>
+      <w:pPr>
+        <w:spacing w:after="140"/>
+        <w:jc w:val="both"/>
+        <w:rPr>
+          <w:lang/>
+        </w:rPr>
+      </w:pPr>
+    </w:p>
+    <w:p>
+      <w:pPr>
+        <w:spacing w:after="140"/>
+        <w:jc w:val="both"/>
+        <w:rPr>
+          <w:lang/>
+        </w:rPr>
+      </w:pPr>
+    </w:p>
+    <w:p>
+      <w:pPr>
+        <w:spacing w:after="140"/>
+        <w:jc w:val="both"/>
+        <w:rPr>
+          <w:lang/>
+        </w:rPr>
+      </w:pPr>
+    </w:p>
+    <w:p>
+      <w:pPr>
+        <w:spacing w:after="140"/>
+        <w:jc w:val="both"/>
+        <w:rPr>
+          <w:lang/>
+        </w:rPr>
+      </w:pPr>
+    </w:p>
+    <w:p>
+      <w:pPr>
+        <w:spacing w:after="140"/>
+        <w:jc w:val="both"/>
+        <w:rPr>
+          <w:lang/>
+        </w:rPr>
+      </w:pPr>
+    </w:p>
+    <w:p>
+      <w:pPr>
+        <w:pStyle w:val="Heading1"/>
+        <w:rPr>
+          <w:lang/>
+        </w:rPr>
+      </w:pPr>
+      <w:r>
+        <w:rPr>
+          <w:lang/>
+        </w:rPr>
+        <w:lastRenderedPageBreak/>
+        <w:t>Useful References</w:t>
+      </w:r>
+    </w:p>
+    <w:p>
+      <w:pPr>
+        <w:rPr>
+          <w:lang/>
+        </w:rPr>
+      </w:pPr>
+    </w:p>
+    <w:p>
+      <w:pPr>
+        <w:jc w:val="both"/>
+        <w:rPr>
+          <w:lang/>
+        </w:rPr>
+      </w:pPr>
+      <w:r>
+        <w:t xml:space="preserve">[1] G. W. Hart, "Nonintrusive appliance load monitoring," </w:t>
+      </w:r>
+      <w:r>
+        <w:rPr>
+          <w:i/>
+          <w:iCs/>
+        </w:rPr>
+        <w:t>Proceedings of the IEEE</w:t>
+      </w:r>
+      <w:r>
+        <w:t>, vol. 80, no. 12, pp. 1870–1891, Dec. 1992, doi: 10.1109/5.192069.</w:t>
+      </w:r>
+    </w:p>
+    <w:p>
+      <w:pPr>
+        <w:jc w:val="both"/>
+        <w:rPr>
+          <w:lang/>
+        </w:rPr>
+      </w:pPr>
+    </w:p>
+    <w:p>
+      <w:pPr>
+        <w:jc w:val="both"/>
+        <w:rPr>
+          <w:lang/>
+        </w:rPr>
+      </w:pPr>
+      <w:r>
+        <w:t xml:space="preserve">[2] Y. Wu, J. Yu, J. Chen, X. Yang, H. Shao, and X. Wang, "DualNILM: Energy Injection Identification Enabled Disaggregation with Deep Multi-Task Learning," arXiv preprint arXiv:2508.14600, Aug. 2025. [Online]. Available: </w:t>
+      </w:r>
+      <w:hyperlink r:id="rId13" w:history="1">
+        <w:r>
+          <w:rPr>
+            <w:rStyle w:val="Hyperlink"/>
+          </w:rPr>
+          <w:t>https://arxiv.org/abs/2508.14600</w:t>
+        </w:r>
+      </w:hyperlink>
+    </w:p>
+    <w:p>
+      <w:pPr>
+        <w:jc w:val="both"/>
+        <w:rPr>
+          <w:lang/>
+        </w:rPr>
+      </w:pPr>
+    </w:p>
+    <w:p>
+      <w:pPr>
+        <w:jc w:val="both"/>
+        <w:rPr>
+          <w:lang/>
+        </w:rPr>
+      </w:pPr>
+      <w:r>
+        <w:t>[</w:t>
+      </w:r>
+      <w:r>
+        <w:rPr>
+          <w:lang/>
+        </w:rPr>
+        <w:t>3</w:t>
+      </w:r>
+      <w:r>
+        <w:t xml:space="preserve">] S. R. Sahoo, F. Khalaj, B. Karki, and M. Khalaj, "A feature fusion technique for improved non-intrusive load monitoring," </w:t>
+      </w:r>
+      <w:r>
+        <w:rPr>
+          <w:i/>
+          <w:iCs/>
+        </w:rPr>
+        <w:t>Energy Informatics</w:t>
+      </w:r>
+      <w:r>
+        <w:t>, vol. 3, no. 1, p. 13, Sep. 2020, doi: 10.1186/s42162-020-00112-w.</w:t>
+      </w:r>
+    </w:p>
+    <w:p>
+      <w:pPr>
+        <w:jc w:val="both"/>
+        <w:rPr>
+          <w:lang/>
+        </w:rPr>
+      </w:pPr>
+    </w:p>
+    <w:p>
+      <w:pPr>
+        <w:jc w:val="both"/>
+        <w:rPr>
+          <w:lang/>
+        </w:rPr>
+      </w:pPr>
+      <w:r>
+        <w:t>[</w:t>
+      </w:r>
+      <w:r>
+        <w:rPr>
+          <w:lang/>
+        </w:rPr>
+        <w:t>4</w:t>
+      </w:r>
+      <w:r>
+        <w:t xml:space="preserve">] Siemens AG, </w:t>
+      </w:r>
+      <w:r>
+        <w:rPr>
+          <w:i/>
+          <w:iCs/>
+        </w:rPr>
+        <w:t>SENTRON PAC4200 Power Monitoring Device Manual</w:t>
+      </w:r>
+      <w:r>
+        <w:t>, Siemens Documentation, 2023. [Online]. Available:</w:t>
+      </w:r>
+      <w:r>
+        <w:t xml:space="preserve"> </w:t>
+      </w:r>
+      <w:hyperlink r:id="rId14" w:history="1">
+        <w:r>
+          <w:rPr>
+            <w:rStyle w:val="Hyperlink"/>
+          </w:rPr>
+          <w:t>https://cache.industry.siemens.com/dl/files/595/34261595/att_951630/v1/manual_pac4200_en-US_en-US.pdf</w:t>
+        </w:r>
+      </w:hyperlink>
+      <w:r>
+        <w:rPr>
+          <w:lang/>
+        </w:rPr>
+        <w:t xml:space="preserve"> (Last access 13.05.2026)</w:t>
+      </w:r>
+    </w:p>
+    <w:p>
+      <w:pPr>
+        <w:jc w:val="both"/>
+        <w:rPr>
+          <w:lang/>
+        </w:rPr>
+      </w:pPr>
+    </w:p>
+    <w:p>
+      <w:pPr>
+        <w:jc w:val="both"/>
+        <w:rPr>
+          <w:lang/>
+        </w:rPr>
+      </w:pPr>
+      <w:r>
+        <w:rPr>
+          <w:lang/>
+        </w:rPr>
+        <w:t>[5</w:t>
+      </w:r>
+      <w:r>
+        <w:t xml:space="preserve">] N. Tsironi, A. P. Sakis Meliopoulos, et al., "Odd Harmonic Distortion Contribution on a Support Vector Machine NILM Approach," in </w:t>
+      </w:r>
+      <w:r>
+        <w:rPr>
+          <w:i/>
+          <w:iCs/>
+        </w:rPr>
+        <w:t>2022 IEEE International Conference</w:t>
+      </w:r>
+      <w:r>
+        <w:t>, 2022, doi:</w:t>
+      </w:r>
+      <w:r>
+        <w:rPr>
+          <w:lang/>
+        </w:rPr>
+        <w:t xml:space="preserve"> </w:t>
+      </w:r>
+      <w:r>
+        <w:rPr>
+          <w:lang/>
+        </w:rPr>
+        <w:t>10.1109/SyNERGYMED55767.2022.9941416</w:t>
+      </w:r>
+      <w:r>
+        <w:t xml:space="preserve">. Available: </w:t>
+      </w:r>
+      <w:hyperlink r:id="rId15" w:history="1">
+        <w:r>
+          <w:rPr>
+            <w:rStyle w:val="Hyperlink"/>
+          </w:rPr>
+          <w:t>https://ieeexplore.ieee.or</w:t>
+        </w:r>
+        <w:r>
+          <w:rPr>
+            <w:rStyle w:val="Hyperlink"/>
+          </w:rPr>
+          <w:t>g</w:t>
+        </w:r>
+        <w:r>
+          <w:rPr>
+            <w:rStyle w:val="Hyperlink"/>
+          </w:rPr>
+          <w:t>/document/9941416</w:t>
+        </w:r>
+      </w:hyperlink>
     </w:p>
     <w:sectPr>
       <w:pgSz w:w="11906" w:h="16838"/>
@@ -2547,6 +3001,30 @@
       <w:szCs w:val="20"/>
     </w:rPr>
   </w:style>
+  <w:style w:type="character" w:styleId="UnresolvedMention">
+    <w:name w:val="Unresolved Mention"/>
+    <w:basedOn w:val="DefaultParagraphFont"/>
+    <w:uiPriority w:val="99"/>
+    <w:semiHidden/>
+    <w:unhideWhenUsed/>
+    <w:rsid w:val="00267EBE"/>
+    <w:rPr>
+      <w:color w:val="605E5C"/>
+      <w:shd w:val="clear" w:color="auto" w:fill="E1DFDD"/>
+    </w:rPr>
+  </w:style>
+  <w:style w:type="character" w:styleId="FollowedHyperlink">
+    <w:name w:val="FollowedHyperlink"/>
+    <w:basedOn w:val="DefaultParagraphFont"/>
+    <w:uiPriority w:val="99"/>
+    <w:semiHidden/>
+    <w:unhideWhenUsed/>
+    <w:rsid w:val="002A681B"/>
+    <w:rPr>
+      <w:color w:val="96607D" w:themeColor="followedHyperlink"/>
+      <w:u w:val="single"/>
+    </w:rPr>
+  </w:style>
 </w:styles>
 </file>
 
@@ -2863,4 +3341,21 @@
     </a:ext>
   </a:extLst>
 </a:theme>
+</file>
+
+<file path=customXml/item1.xml><?xml version="1.0" encoding="utf-8"?>
+<b:Sources xmlns:b="http://schemas.openxmlformats.org/officeDocument/2006/bibliography" xmlns="http://schemas.openxmlformats.org/officeDocument/2006/bibliography" SelectedStyle="\APASixthEditionOfficeOnline.xsl" StyleName="APA" Version="6">
+  <b:Source xmlns:b="http://schemas.openxmlformats.org/officeDocument/2006/bibliography" xmlns="http://schemas.openxmlformats.org/officeDocument/2006/bibliography">
+    <b:Tag>Placeholder1</b:Tag>
+    <b:RefOrder>1</b:RefOrder>
+  </b:Source>
+</b:Sources>
+</file>
+
+<file path=customXml/itemProps1.xml><?xml version="1.0" encoding="utf-8"?>
+<ds:datastoreItem xmlns:ds="http://schemas.openxmlformats.org/officeDocument/2006/customXml" ds:itemID="{928E0860-3578-4CB4-B0F4-5D13C81FAF1E}">
+  <ds:schemaRefs>
+    <ds:schemaRef ds:uri="http://schemas.openxmlformats.org/officeDocument/2006/bibliography"/>
+  </ds:schemaRefs>
+</ds:datastoreItem>
 </file>
</xml_diff>